<commit_message>
发起通Prompt完整性修复: +shadow-2xl +3渐变 +3stagger +CDN代码块 +字重 +wrangler/vite/pm2/package配置 (1359→1461行)
</commit_message>
<xml_diff>
--- a/prompts/OriginateConnect_Build_Prompt.docx
+++ b/prompts/OriginateConnect_Build_Prompt.docx
@@ -42,7 +42,7 @@
       </w:r>
     </w:p>
     <w:bookmarkEnd w:id="23"/>
-    <w:bookmarkStart w:id="87" w:name="section-1"/>
+    <w:bookmarkStart w:id="93" w:name="section-1"/>
     <w:p>
       <w:pPr>
         <w:pStyle w:val="Heading1"/>
@@ -13364,7 +13364,7 @@
     </w:p>
     <w:bookmarkEnd w:id="47"/>
     <w:bookmarkEnd w:id="48"/>
-    <w:bookmarkStart w:id="61" w:name="完整设计系统必须-100-遵守"/>
+    <w:bookmarkStart w:id="62" w:name="完整设计系统必须-100-遵守"/>
     <w:p>
       <w:pPr>
         <w:pStyle w:val="Heading2"/>
@@ -14507,6 +14507,81 @@
         </w:rPr>
         <w:t xml:space="preserve">);</w:t>
       </w:r>
+      <w:r>
+        <w:br/>
+      </w:r>
+      <w:r>
+        <w:rPr>
+          <w:rStyle w:val="NormalTok"/>
+        </w:rPr>
+        <w:t xml:space="preserve">--shadow-2xl</w:t>
+      </w:r>
+      <w:r>
+        <w:rPr>
+          <w:rStyle w:val="InformationTok"/>
+        </w:rPr>
+        <w:t xml:space="preserve">:        0 12px 24px rgba(0,0,0,0.06)</w:t>
+      </w:r>
+      <w:r>
+        <w:rPr>
+          <w:rStyle w:val="OperatorTok"/>
+        </w:rPr>
+        <w:t xml:space="preserve">,</w:t>
+      </w:r>
+      <w:r>
+        <w:rPr>
+          <w:rStyle w:val="NormalTok"/>
+        </w:rPr>
+        <w:t xml:space="preserve"> 0 40px 80px rgba(0</w:t>
+      </w:r>
+      <w:r>
+        <w:rPr>
+          <w:rStyle w:val="OperatorTok"/>
+        </w:rPr>
+        <w:t xml:space="preserve">,</w:t>
+      </w:r>
+      <w:r>
+        <w:rPr>
+          <w:rStyle w:val="NormalTok"/>
+        </w:rPr>
+        <w:t xml:space="preserve">0</w:t>
+      </w:r>
+      <w:r>
+        <w:rPr>
+          <w:rStyle w:val="OperatorTok"/>
+        </w:rPr>
+        <w:t xml:space="preserve">,</w:t>
+      </w:r>
+      <w:r>
+        <w:rPr>
+          <w:rStyle w:val="NormalTok"/>
+        </w:rPr>
+        <w:t xml:space="preserve">0</w:t>
+      </w:r>
+      <w:r>
+        <w:rPr>
+          <w:rStyle w:val="OperatorTok"/>
+        </w:rPr>
+        <w:t xml:space="preserve">,</w:t>
+      </w:r>
+      <w:r>
+        <w:rPr>
+          <w:rStyle w:val="NormalTok"/>
+        </w:rPr>
+        <w:t xml:space="preserve">0</w:t>
+      </w:r>
+      <w:r>
+        <w:rPr>
+          <w:rStyle w:val="FunctionTok"/>
+        </w:rPr>
+        <w:t xml:space="preserve">.12</w:t>
+      </w:r>
+      <w:r>
+        <w:rPr>
+          <w:rStyle w:val="NormalTok"/>
+        </w:rPr>
+        <w:t xml:space="preserve">);</w:t>
+      </w:r>
     </w:p>
     <w:bookmarkEnd w:id="56"/>
     <w:bookmarkStart w:id="57" w:name="动效"/>
@@ -14762,6 +14837,129 @@
         </w:rPr>
         <w:t xml:space="preserve">;</w:t>
       </w:r>
+      <w:r>
+        <w:br/>
+      </w:r>
+      <w:r>
+        <w:rPr>
+          <w:rStyle w:val="NormalTok"/>
+        </w:rPr>
+        <w:t xml:space="preserve">--gradient-neon</w:t>
+      </w:r>
+      <w:r>
+        <w:rPr>
+          <w:rStyle w:val="InformationTok"/>
+        </w:rPr>
+        <w:t xml:space="preserve">:     linear-gradient(135deg, #32ade6 0%, #5DC4B3 40%, #49A89A 70%, #3D8F83 100%)</w:t>
+      </w:r>
+      <w:r>
+        <w:rPr>
+          <w:rStyle w:val="NormalTok"/>
+        </w:rPr>
+        <w:t xml:space="preserve">;</w:t>
+      </w:r>
+      <w:r>
+        <w:br/>
+      </w:r>
+      <w:r>
+        <w:rPr>
+          <w:rStyle w:val="NormalTok"/>
+        </w:rPr>
+        <w:t xml:space="preserve">--gradient-glass</w:t>
+      </w:r>
+      <w:r>
+        <w:rPr>
+          <w:rStyle w:val="InformationTok"/>
+        </w:rPr>
+        <w:t xml:space="preserve">:    linear-gradient(135deg, rgba(255,255,255,0.12)</w:t>
+      </w:r>
+      <w:r>
+        <w:rPr>
+          <w:rStyle w:val="NormalTok"/>
+        </w:rPr>
+        <w:t xml:space="preserve"> 0%</w:t>
+      </w:r>
+      <w:r>
+        <w:rPr>
+          <w:rStyle w:val="OperatorTok"/>
+        </w:rPr>
+        <w:t xml:space="preserve">,</w:t>
+      </w:r>
+      <w:r>
+        <w:rPr>
+          <w:rStyle w:val="NormalTok"/>
+        </w:rPr>
+        <w:t xml:space="preserve"> rgba(255</w:t>
+      </w:r>
+      <w:r>
+        <w:rPr>
+          <w:rStyle w:val="OperatorTok"/>
+        </w:rPr>
+        <w:t xml:space="preserve">,</w:t>
+      </w:r>
+      <w:r>
+        <w:rPr>
+          <w:rStyle w:val="NormalTok"/>
+        </w:rPr>
+        <w:t xml:space="preserve">255</w:t>
+      </w:r>
+      <w:r>
+        <w:rPr>
+          <w:rStyle w:val="OperatorTok"/>
+        </w:rPr>
+        <w:t xml:space="preserve">,</w:t>
+      </w:r>
+      <w:r>
+        <w:rPr>
+          <w:rStyle w:val="NormalTok"/>
+        </w:rPr>
+        <w:t xml:space="preserve">255</w:t>
+      </w:r>
+      <w:r>
+        <w:rPr>
+          <w:rStyle w:val="OperatorTok"/>
+        </w:rPr>
+        <w:t xml:space="preserve">,</w:t>
+      </w:r>
+      <w:r>
+        <w:rPr>
+          <w:rStyle w:val="NormalTok"/>
+        </w:rPr>
+        <w:t xml:space="preserve">0</w:t>
+      </w:r>
+      <w:r>
+        <w:rPr>
+          <w:rStyle w:val="FunctionTok"/>
+        </w:rPr>
+        <w:t xml:space="preserve">.04</w:t>
+      </w:r>
+      <w:r>
+        <w:rPr>
+          <w:rStyle w:val="NormalTok"/>
+        </w:rPr>
+        <w:t xml:space="preserve">) 100%);</w:t>
+      </w:r>
+      <w:r>
+        <w:br/>
+      </w:r>
+      <w:r>
+        <w:rPr>
+          <w:rStyle w:val="NormalTok"/>
+        </w:rPr>
+        <w:t xml:space="preserve">--gradient-surface</w:t>
+      </w:r>
+      <w:r>
+        <w:rPr>
+          <w:rStyle w:val="InformationTok"/>
+        </w:rPr>
+        <w:t xml:space="preserve">:  linear-gradient(180deg, #ffffff 0%, #f8f9fe 100%)</w:t>
+      </w:r>
+      <w:r>
+        <w:rPr>
+          <w:rStyle w:val="NormalTok"/>
+        </w:rPr>
+        <w:t xml:space="preserve">;</w:t>
+      </w:r>
     </w:p>
     <w:bookmarkEnd w:id="58"/>
     <w:bookmarkStart w:id="59" w:name="字体"/>
@@ -14781,6 +14979,45 @@
         <w:rPr>
           <w:rStyle w:val="VerbatimChar"/>
         </w:rPr>
+        <w:t xml:space="preserve">Google Fonts 加载:</w:t>
+      </w:r>
+      <w:r>
+        <w:br/>
+      </w:r>
+      <w:r>
+        <w:rPr>
+          <w:rStyle w:val="VerbatimChar"/>
+        </w:rPr>
+        <w:t xml:space="preserve">  Inter:        wght@300;400;500;600;700;800;900</w:t>
+      </w:r>
+      <w:r>
+        <w:br/>
+      </w:r>
+      <w:r>
+        <w:rPr>
+          <w:rStyle w:val="VerbatimChar"/>
+        </w:rPr>
+        <w:t xml:space="preserve">  Montserrat:   wght@700;800;900</w:t>
+      </w:r>
+      <w:r>
+        <w:br/>
+      </w:r>
+      <w:r>
+        <w:rPr>
+          <w:rStyle w:val="VerbatimChar"/>
+        </w:rPr>
+        <w:t xml:space="preserve">  Noto Sans SC: wght@300;400;500;600;700</w:t>
+      </w:r>
+      <w:r>
+        <w:br/>
+      </w:r>
+      <w:r>
+        <w:br/>
+      </w:r>
+      <w:r>
+        <w:rPr>
+          <w:rStyle w:val="VerbatimChar"/>
+        </w:rPr>
         <w:t xml:space="preserve">正文字体栈:</w:t>
       </w:r>
       <w:r>
@@ -14824,7 +15061,280 @@
       </w:r>
     </w:p>
     <w:bookmarkEnd w:id="59"/>
-    <w:bookmarkStart w:id="60" w:name="tailwind-css-运行时配置"/>
+    <w:bookmarkStart w:id="60" w:name="cdn-依赖放在每个页面的-head-中"/>
+    <w:p>
+      <w:pPr>
+        <w:pStyle w:val="Heading3"/>
+      </w:pPr>
+      <w:r>
+        <w:t xml:space="preserve">CDN 依赖（放在每个页面的</w:t>
+      </w:r>
+      <w:r>
+        <w:t xml:space="preserve"> </w:t>
+      </w:r>
+      <w:r>
+        <w:rPr>
+          <w:rStyle w:val="VerbatimChar"/>
+        </w:rPr>
+        <w:t xml:space="preserve">&lt;head&gt;</w:t>
+      </w:r>
+      <w:r>
+        <w:t xml:space="preserve"> </w:t>
+      </w:r>
+      <w:r>
+        <w:t xml:space="preserve">中）</w:t>
+      </w:r>
+    </w:p>
+    <w:p>
+      <w:pPr>
+        <w:pStyle w:val="SourceCode"/>
+      </w:pPr>
+      <w:r>
+        <w:rPr>
+          <w:rStyle w:val="CommentTok"/>
+        </w:rPr>
+        <w:t xml:space="preserve">&lt;!-- Tailwind CSS --&gt;</w:t>
+      </w:r>
+      <w:r>
+        <w:br/>
+      </w:r>
+      <w:r>
+        <w:rPr>
+          <w:rStyle w:val="KeywordTok"/>
+        </w:rPr>
+        <w:t xml:space="preserve">&lt;script</w:t>
+      </w:r>
+      <w:r>
+        <w:rPr>
+          <w:rStyle w:val="NormalTok"/>
+        </w:rPr>
+        <w:t xml:space="preserve"> </w:t>
+      </w:r>
+      <w:r>
+        <w:rPr>
+          <w:rStyle w:val="ErrorTok"/>
+        </w:rPr>
+        <w:t xml:space="preserve">src</w:t>
+      </w:r>
+      <w:r>
+        <w:rPr>
+          <w:rStyle w:val="OtherTok"/>
+        </w:rPr>
+        <w:t xml:space="preserve">=</w:t>
+      </w:r>
+      <w:r>
+        <w:rPr>
+          <w:rStyle w:val="StringTok"/>
+        </w:rPr>
+        <w:t xml:space="preserve">"https://cdn.tailwindcss.com"</w:t>
+      </w:r>
+      <w:r>
+        <w:rPr>
+          <w:rStyle w:val="KeywordTok"/>
+        </w:rPr>
+        <w:t xml:space="preserve">&gt;&lt;/script&gt;</w:t>
+      </w:r>
+      <w:r>
+        <w:br/>
+      </w:r>
+      <w:r>
+        <w:br/>
+      </w:r>
+      <w:r>
+        <w:rPr>
+          <w:rStyle w:val="CommentTok"/>
+        </w:rPr>
+        <w:t xml:space="preserve">&lt;!-- FontAwesome 6.4 --&gt;</w:t>
+      </w:r>
+      <w:r>
+        <w:br/>
+      </w:r>
+      <w:r>
+        <w:rPr>
+          <w:rStyle w:val="KeywordTok"/>
+        </w:rPr>
+        <w:t xml:space="preserve">&lt;link</w:t>
+      </w:r>
+      <w:r>
+        <w:rPr>
+          <w:rStyle w:val="NormalTok"/>
+        </w:rPr>
+        <w:t xml:space="preserve"> </w:t>
+      </w:r>
+      <w:r>
+        <w:rPr>
+          <w:rStyle w:val="ErrorTok"/>
+        </w:rPr>
+        <w:t xml:space="preserve">href</w:t>
+      </w:r>
+      <w:r>
+        <w:rPr>
+          <w:rStyle w:val="OtherTok"/>
+        </w:rPr>
+        <w:t xml:space="preserve">=</w:t>
+      </w:r>
+      <w:r>
+        <w:rPr>
+          <w:rStyle w:val="StringTok"/>
+        </w:rPr>
+        <w:t xml:space="preserve">"https://cdn.jsdelivr.net/npm/@fortawesome/fontawesome-free@6.4.0/css/all.min.css"</w:t>
+      </w:r>
+      <w:r>
+        <w:rPr>
+          <w:rStyle w:val="NormalTok"/>
+        </w:rPr>
+        <w:t xml:space="preserve"> </w:t>
+      </w:r>
+      <w:r>
+        <w:rPr>
+          <w:rStyle w:val="ErrorTok"/>
+        </w:rPr>
+        <w:t xml:space="preserve">rel</w:t>
+      </w:r>
+      <w:r>
+        <w:rPr>
+          <w:rStyle w:val="OtherTok"/>
+        </w:rPr>
+        <w:t xml:space="preserve">=</w:t>
+      </w:r>
+      <w:r>
+        <w:rPr>
+          <w:rStyle w:val="StringTok"/>
+        </w:rPr>
+        <w:t xml:space="preserve">"stylesheet"</w:t>
+      </w:r>
+      <w:r>
+        <w:rPr>
+          <w:rStyle w:val="NormalTok"/>
+        </w:rPr>
+        <w:t xml:space="preserve"> </w:t>
+      </w:r>
+      <w:r>
+        <w:rPr>
+          <w:rStyle w:val="KeywordTok"/>
+        </w:rPr>
+        <w:t xml:space="preserve">/&gt;</w:t>
+      </w:r>
+      <w:r>
+        <w:br/>
+      </w:r>
+      <w:r>
+        <w:br/>
+      </w:r>
+      <w:r>
+        <w:rPr>
+          <w:rStyle w:val="CommentTok"/>
+        </w:rPr>
+        <w:t xml:space="preserve">&lt;!-- Google Fonts --&gt;</w:t>
+      </w:r>
+      <w:r>
+        <w:br/>
+      </w:r>
+      <w:r>
+        <w:rPr>
+          <w:rStyle w:val="KeywordTok"/>
+        </w:rPr>
+        <w:t xml:space="preserve">&lt;link</w:t>
+      </w:r>
+      <w:r>
+        <w:rPr>
+          <w:rStyle w:val="NormalTok"/>
+        </w:rPr>
+        <w:t xml:space="preserve"> </w:t>
+      </w:r>
+      <w:r>
+        <w:rPr>
+          <w:rStyle w:val="ErrorTok"/>
+        </w:rPr>
+        <w:t xml:space="preserve">href</w:t>
+      </w:r>
+      <w:r>
+        <w:rPr>
+          <w:rStyle w:val="OtherTok"/>
+        </w:rPr>
+        <w:t xml:space="preserve">=</w:t>
+      </w:r>
+      <w:r>
+        <w:rPr>
+          <w:rStyle w:val="StringTok"/>
+        </w:rPr>
+        <w:t xml:space="preserve">"https://fonts.googleapis.com/css2?family=Inter:wght@300;400;500;600;700;800;900</w:t>
+      </w:r>
+      <w:r>
+        <w:rPr>
+          <w:rStyle w:val="ErrorTok"/>
+        </w:rPr>
+        <w:t xml:space="preserve">&amp;</w:t>
+      </w:r>
+      <w:r>
+        <w:rPr>
+          <w:rStyle w:val="StringTok"/>
+        </w:rPr>
+        <w:t xml:space="preserve">family=Montserrat:wght@700;800;900</w:t>
+      </w:r>
+      <w:r>
+        <w:rPr>
+          <w:rStyle w:val="ErrorTok"/>
+        </w:rPr>
+        <w:t xml:space="preserve">&amp;</w:t>
+      </w:r>
+      <w:r>
+        <w:rPr>
+          <w:rStyle w:val="StringTok"/>
+        </w:rPr>
+        <w:t xml:space="preserve">family=Noto+Sans+SC:wght@300;400;500;600;700</w:t>
+      </w:r>
+      <w:r>
+        <w:rPr>
+          <w:rStyle w:val="ErrorTok"/>
+        </w:rPr>
+        <w:t xml:space="preserve">&amp;</w:t>
+      </w:r>
+      <w:r>
+        <w:rPr>
+          <w:rStyle w:val="StringTok"/>
+        </w:rPr>
+        <w:t xml:space="preserve">display=swap"</w:t>
+      </w:r>
+      <w:r>
+        <w:rPr>
+          <w:rStyle w:val="NormalTok"/>
+        </w:rPr>
+        <w:t xml:space="preserve"> </w:t>
+      </w:r>
+      <w:r>
+        <w:rPr>
+          <w:rStyle w:val="ErrorTok"/>
+        </w:rPr>
+        <w:t xml:space="preserve">rel</w:t>
+      </w:r>
+      <w:r>
+        <w:rPr>
+          <w:rStyle w:val="OtherTok"/>
+        </w:rPr>
+        <w:t xml:space="preserve">=</w:t>
+      </w:r>
+      <w:r>
+        <w:rPr>
+          <w:rStyle w:val="StringTok"/>
+        </w:rPr>
+        <w:t xml:space="preserve">"stylesheet"</w:t>
+      </w:r>
+      <w:r>
+        <w:rPr>
+          <w:rStyle w:val="NormalTok"/>
+        </w:rPr>
+        <w:t xml:space="preserve"> </w:t>
+      </w:r>
+      <w:r>
+        <w:rPr>
+          <w:rStyle w:val="KeywordTok"/>
+        </w:rPr>
+        <w:t xml:space="preserve">/&gt;</w:t>
+      </w:r>
+    </w:p>
+    <w:bookmarkEnd w:id="60"/>
+    <w:bookmarkStart w:id="61" w:name="tailwind-css-运行时配置"/>
     <w:p>
       <w:pPr>
         <w:pStyle w:val="Heading3"/>
@@ -14853,7 +15363,22 @@
         <w:t xml:space="preserve"> </w:t>
       </w:r>
       <w:r>
-        <w:t xml:space="preserve">中必须包含：</w:t>
+        <w:t xml:space="preserve">中必须包含（紧跟在 Tailwind CDN</w:t>
+      </w:r>
+      <w:r>
+        <w:t xml:space="preserve"> </w:t>
+      </w:r>
+      <w:r>
+        <w:rPr>
+          <w:rStyle w:val="VerbatimChar"/>
+        </w:rPr>
+        <w:t xml:space="preserve">&lt;script&gt;</w:t>
+      </w:r>
+      <w:r>
+        <w:t xml:space="preserve"> </w:t>
+      </w:r>
+      <w:r>
+        <w:t xml:space="preserve">之后）：</w:t>
       </w:r>
     </w:p>
     <w:p>
@@ -16437,9 +16962,9 @@
         </w:pict>
       </w:r>
     </w:p>
-    <w:bookmarkEnd w:id="60"/>
     <w:bookmarkEnd w:id="61"/>
-    <w:bookmarkStart w:id="72" w:name="ui-组件"/>
+    <w:bookmarkEnd w:id="62"/>
+    <w:bookmarkStart w:id="73" w:name="ui-组件"/>
     <w:p>
       <w:pPr>
         <w:pStyle w:val="Heading2"/>
@@ -16448,7 +16973,7 @@
         <w:t xml:space="preserve">UI 组件</w:t>
       </w:r>
     </w:p>
-    <w:bookmarkStart w:id="62" w:name="导航栏-navbar-独立应用简化版"/>
+    <w:bookmarkStart w:id="63" w:name="导航栏-navbar-独立应用简化版"/>
     <w:p>
       <w:pPr>
         <w:pStyle w:val="Heading3"/>
@@ -16672,8 +17197,8 @@
         <w:t xml:space="preserve">按钮（品牌色 #5DC4B3）</w:t>
       </w:r>
     </w:p>
-    <w:bookmarkEnd w:id="62"/>
-    <w:bookmarkStart w:id="63" w:name="页脚-footer-独立应用简化版"/>
+    <w:bookmarkEnd w:id="63"/>
+    <w:bookmarkStart w:id="64" w:name="页脚-footer-独立应用简化版"/>
     <w:p>
       <w:pPr>
         <w:pStyle w:val="Heading3"/>
@@ -16775,8 +17300,8 @@
         <w:t xml:space="preserve">: 返回主站 | 隐私政策 | 服务条款</w:t>
       </w:r>
     </w:p>
-    <w:bookmarkEnd w:id="63"/>
-    <w:bookmarkStart w:id="64" w:name="品牌-logo-svg"/>
+    <w:bookmarkEnd w:id="64"/>
+    <w:bookmarkStart w:id="65" w:name="品牌-logo-svg"/>
     <w:p>
       <w:pPr>
         <w:pStyle w:val="Heading3"/>
@@ -17784,8 +18309,8 @@
         <w:t xml:space="preserve">（英文部分用 Montserrat 字体）</w:t>
       </w:r>
     </w:p>
-    <w:bookmarkEnd w:id="64"/>
-    <w:bookmarkStart w:id="65" w:name="卡片样式"/>
+    <w:bookmarkEnd w:id="65"/>
+    <w:bookmarkStart w:id="66" w:name="卡片样式"/>
     <w:p>
       <w:pPr>
         <w:pStyle w:val="Heading3"/>
@@ -19053,8 +19578,8 @@
         <w:t xml:space="preserve">}</w:t>
       </w:r>
     </w:p>
-    <w:bookmarkEnd w:id="65"/>
-    <w:bookmarkStart w:id="66" w:name="上传区样式"/>
+    <w:bookmarkEnd w:id="66"/>
+    <w:bookmarkStart w:id="67" w:name="上传区样式"/>
     <w:p>
       <w:pPr>
         <w:pStyle w:val="Heading3"/>
@@ -19782,8 +20307,8 @@
         <w:t xml:space="preserve">}</w:t>
       </w:r>
     </w:p>
-    <w:bookmarkEnd w:id="66"/>
-    <w:bookmarkStart w:id="67" w:name="步骤指示器样式"/>
+    <w:bookmarkEnd w:id="67"/>
+    <w:bookmarkStart w:id="68" w:name="步骤指示器样式"/>
     <w:p>
       <w:pPr>
         <w:pStyle w:val="Heading3"/>
@@ -21141,8 +21666,8 @@
         <w:t xml:space="preserve">}</w:t>
       </w:r>
     </w:p>
-    <w:bookmarkEnd w:id="67"/>
-    <w:bookmarkStart w:id="68" w:name="滚动渐现动画"/>
+    <w:bookmarkEnd w:id="68"/>
+    <w:bookmarkStart w:id="69" w:name="滚动渐现动画"/>
     <w:p>
       <w:pPr>
         <w:pStyle w:val="Heading3"/>
@@ -21668,6 +22193,159 @@
         </w:rPr>
         <w:t xml:space="preserve"> }</w:t>
       </w:r>
+      <w:r>
+        <w:br/>
+      </w:r>
+      <w:r>
+        <w:rPr>
+          <w:rStyle w:val="FunctionTok"/>
+        </w:rPr>
+        <w:t xml:space="preserve">.stagger-4</w:t>
+      </w:r>
+      <w:r>
+        <w:rPr>
+          <w:rStyle w:val="NormalTok"/>
+        </w:rPr>
+        <w:t xml:space="preserve"> { </w:t>
+      </w:r>
+      <w:r>
+        <w:rPr>
+          <w:rStyle w:val="KeywordTok"/>
+        </w:rPr>
+        <w:t xml:space="preserve">transition-delay</w:t>
+      </w:r>
+      <w:r>
+        <w:rPr>
+          <w:rStyle w:val="NormalTok"/>
+        </w:rPr>
+        <w:t xml:space="preserve">: </w:t>
+      </w:r>
+      <w:r>
+        <w:rPr>
+          <w:rStyle w:val="DecValTok"/>
+        </w:rPr>
+        <w:t xml:space="preserve">0.20</w:t>
+      </w:r>
+      <w:r>
+        <w:rPr>
+          <w:rStyle w:val="DataTypeTok"/>
+        </w:rPr>
+        <w:t xml:space="preserve">s</w:t>
+      </w:r>
+      <w:r>
+        <w:rPr>
+          <w:rStyle w:val="OperatorTok"/>
+        </w:rPr>
+        <w:t xml:space="preserve">;</w:t>
+      </w:r>
+      <w:r>
+        <w:rPr>
+          <w:rStyle w:val="NormalTok"/>
+        </w:rPr>
+        <w:t xml:space="preserve"> }</w:t>
+      </w:r>
+      <w:r>
+        <w:br/>
+      </w:r>
+      <w:r>
+        <w:rPr>
+          <w:rStyle w:val="FunctionTok"/>
+        </w:rPr>
+        <w:t xml:space="preserve">.stagger-5</w:t>
+      </w:r>
+      <w:r>
+        <w:rPr>
+          <w:rStyle w:val="NormalTok"/>
+        </w:rPr>
+        <w:t xml:space="preserve"> { </w:t>
+      </w:r>
+      <w:r>
+        <w:rPr>
+          <w:rStyle w:val="KeywordTok"/>
+        </w:rPr>
+        <w:t xml:space="preserve">transition-delay</w:t>
+      </w:r>
+      <w:r>
+        <w:rPr>
+          <w:rStyle w:val="NormalTok"/>
+        </w:rPr>
+        <w:t xml:space="preserve">: </w:t>
+      </w:r>
+      <w:r>
+        <w:rPr>
+          <w:rStyle w:val="DecValTok"/>
+        </w:rPr>
+        <w:t xml:space="preserve">0.25</w:t>
+      </w:r>
+      <w:r>
+        <w:rPr>
+          <w:rStyle w:val="DataTypeTok"/>
+        </w:rPr>
+        <w:t xml:space="preserve">s</w:t>
+      </w:r>
+      <w:r>
+        <w:rPr>
+          <w:rStyle w:val="OperatorTok"/>
+        </w:rPr>
+        <w:t xml:space="preserve">;</w:t>
+      </w:r>
+      <w:r>
+        <w:rPr>
+          <w:rStyle w:val="NormalTok"/>
+        </w:rPr>
+        <w:t xml:space="preserve"> }</w:t>
+      </w:r>
+      <w:r>
+        <w:br/>
+      </w:r>
+      <w:r>
+        <w:rPr>
+          <w:rStyle w:val="FunctionTok"/>
+        </w:rPr>
+        <w:t xml:space="preserve">.stagger-6</w:t>
+      </w:r>
+      <w:r>
+        <w:rPr>
+          <w:rStyle w:val="NormalTok"/>
+        </w:rPr>
+        <w:t xml:space="preserve"> { </w:t>
+      </w:r>
+      <w:r>
+        <w:rPr>
+          <w:rStyle w:val="KeywordTok"/>
+        </w:rPr>
+        <w:t xml:space="preserve">transition-delay</w:t>
+      </w:r>
+      <w:r>
+        <w:rPr>
+          <w:rStyle w:val="NormalTok"/>
+        </w:rPr>
+        <w:t xml:space="preserve">: </w:t>
+      </w:r>
+      <w:r>
+        <w:rPr>
+          <w:rStyle w:val="DecValTok"/>
+        </w:rPr>
+        <w:t xml:space="preserve">0.30</w:t>
+      </w:r>
+      <w:r>
+        <w:rPr>
+          <w:rStyle w:val="DataTypeTok"/>
+        </w:rPr>
+        <w:t xml:space="preserve">s</w:t>
+      </w:r>
+      <w:r>
+        <w:rPr>
+          <w:rStyle w:val="OperatorTok"/>
+        </w:rPr>
+        <w:t xml:space="preserve">;</w:t>
+      </w:r>
+      <w:r>
+        <w:rPr>
+          <w:rStyle w:val="NormalTok"/>
+        </w:rPr>
+        <w:t xml:space="preserve"> }</w:t>
+      </w:r>
     </w:p>
     <w:p>
       <w:pPr>
@@ -21988,8 +22666,8 @@
         <w:t xml:space="preserve">;</w:t>
       </w:r>
     </w:p>
-    <w:bookmarkEnd w:id="68"/>
-    <w:bookmarkStart w:id="69" w:name="状态徽章"/>
+    <w:bookmarkEnd w:id="69"/>
+    <w:bookmarkStart w:id="70" w:name="状态徽章"/>
     <w:p>
       <w:pPr>
         <w:pStyle w:val="Heading3"/>
@@ -22036,8 +22714,8 @@
         <w:t xml:space="preserve">draft (草稿):         bg-gray-100 text-gray-500 border-gray-200</w:t>
       </w:r>
     </w:p>
-    <w:bookmarkEnd w:id="69"/>
-    <w:bookmarkStart w:id="70" w:name="文件类型图标"/>
+    <w:bookmarkEnd w:id="70"/>
+    <w:bookmarkStart w:id="71" w:name="文件类型图标"/>
     <w:p>
       <w:pPr>
         <w:pStyle w:val="Heading3"/>
@@ -22102,8 +22780,8 @@
         <w:t xml:space="preserve">other:  fa-file         text-gray-400</w:t>
       </w:r>
     </w:p>
-    <w:bookmarkEnd w:id="70"/>
-    <w:bookmarkStart w:id="71" w:name="点阵背景图案"/>
+    <w:bookmarkEnd w:id="71"/>
+    <w:bookmarkStart w:id="72" w:name="点阵背景图案"/>
     <w:p>
       <w:pPr>
         <w:pStyle w:val="Heading3"/>
@@ -22319,9 +22997,9 @@
         </w:pict>
       </w:r>
     </w:p>
-    <w:bookmarkEnd w:id="71"/>
     <w:bookmarkEnd w:id="72"/>
-    <w:bookmarkStart w:id="75" w:name="i18n-国际化"/>
+    <w:bookmarkEnd w:id="73"/>
+    <w:bookmarkStart w:id="76" w:name="i18n-国际化"/>
     <w:p>
       <w:pPr>
         <w:pStyle w:val="Heading2"/>
@@ -22330,7 +23008,7 @@
         <w:t xml:space="preserve">i18n 国际化</w:t>
       </w:r>
     </w:p>
-    <w:bookmarkStart w:id="73" w:name="规范"/>
+    <w:bookmarkStart w:id="74" w:name="规范"/>
     <w:p>
       <w:pPr>
         <w:pStyle w:val="Heading3"/>
@@ -22445,8 +23123,8 @@
         <w:t xml:space="preserve">¥680K</w:t>
       </w:r>
     </w:p>
-    <w:bookmarkEnd w:id="73"/>
-    <w:bookmarkStart w:id="74" w:name="双语文本对象"/>
+    <w:bookmarkEnd w:id="74"/>
+    <w:bookmarkStart w:id="75" w:name="双语文本对象"/>
     <w:p>
       <w:pPr>
         <w:pStyle w:val="Heading3"/>
@@ -29556,9 +30234,9 @@
         </w:pict>
       </w:r>
     </w:p>
-    <w:bookmarkEnd w:id="74"/>
     <w:bookmarkEnd w:id="75"/>
-    <w:bookmarkStart w:id="83" w:name="项目初始化与开发流程"/>
+    <w:bookmarkEnd w:id="76"/>
+    <w:bookmarkStart w:id="89" w:name="项目初始化与开发流程"/>
     <w:p>
       <w:pPr>
         <w:pStyle w:val="Heading2"/>
@@ -29567,7 +30245,7 @@
         <w:t xml:space="preserve">项目初始化与开发流程</w:t>
       </w:r>
     </w:p>
-    <w:bookmarkStart w:id="76" w:name="步骤-1-创建项目"/>
+    <w:bookmarkStart w:id="77" w:name="步骤-1-创建项目"/>
     <w:p>
       <w:pPr>
         <w:pStyle w:val="Heading3"/>
@@ -29641,8 +30319,8 @@
         <w:t xml:space="preserve"> npm</w:t>
       </w:r>
     </w:p>
-    <w:bookmarkEnd w:id="76"/>
-    <w:bookmarkStart w:id="77" w:name="步骤-2-项目结构"/>
+    <w:bookmarkEnd w:id="77"/>
+    <w:bookmarkStart w:id="78" w:name="步骤-2-项目结构"/>
     <w:p>
       <w:pPr>
         <w:pStyle w:val="Heading3"/>
@@ -29770,8 +30448,1013 @@
         <w:t xml:space="preserve">└── package.json</w:t>
       </w:r>
     </w:p>
-    <w:bookmarkEnd w:id="77"/>
-    <w:bookmarkStart w:id="78" w:name="步骤-3-实现顺序"/>
+    <w:bookmarkEnd w:id="78"/>
+    <w:bookmarkStart w:id="79" w:name="wrangler.jsonc-配置模板"/>
+    <w:p>
+      <w:pPr>
+        <w:pStyle w:val="Heading3"/>
+      </w:pPr>
+      <w:r>
+        <w:t xml:space="preserve">wrangler.jsonc 配置模板</w:t>
+      </w:r>
+    </w:p>
+    <w:p>
+      <w:pPr>
+        <w:pStyle w:val="SourceCode"/>
+      </w:pPr>
+      <w:r>
+        <w:rPr>
+          <w:rStyle w:val="VerbatimChar"/>
+        </w:rPr>
+        <w:t xml:space="preserve">{</w:t>
+      </w:r>
+      <w:r>
+        <w:br/>
+      </w:r>
+      <w:r>
+        <w:rPr>
+          <w:rStyle w:val="VerbatimChar"/>
+        </w:rPr>
+        <w:t xml:space="preserve">  "$schema": "node_modules/wrangler/config-schema.json",</w:t>
+      </w:r>
+      <w:r>
+        <w:br/>
+      </w:r>
+      <w:r>
+        <w:rPr>
+          <w:rStyle w:val="VerbatimChar"/>
+        </w:rPr>
+        <w:t xml:space="preserve">  "name": "originate-connect",</w:t>
+      </w:r>
+      <w:r>
+        <w:br/>
+      </w:r>
+      <w:r>
+        <w:rPr>
+          <w:rStyle w:val="VerbatimChar"/>
+        </w:rPr>
+        <w:t xml:space="preserve">  "compatibility_date": "2024-01-01",</w:t>
+      </w:r>
+      <w:r>
+        <w:br/>
+      </w:r>
+      <w:r>
+        <w:rPr>
+          <w:rStyle w:val="VerbatimChar"/>
+        </w:rPr>
+        <w:t xml:space="preserve">  "pages_build_output_dir": "./dist",</w:t>
+      </w:r>
+      <w:r>
+        <w:br/>
+      </w:r>
+      <w:r>
+        <w:rPr>
+          <w:rStyle w:val="VerbatimChar"/>
+        </w:rPr>
+        <w:t xml:space="preserve">  "compatibility_flags": ["nodejs_compat"]</w:t>
+      </w:r>
+      <w:r>
+        <w:br/>
+      </w:r>
+      <w:r>
+        <w:rPr>
+          <w:rStyle w:val="VerbatimChar"/>
+        </w:rPr>
+        <w:t xml:space="preserve">}</w:t>
+      </w:r>
+    </w:p>
+    <w:bookmarkEnd w:id="79"/>
+    <w:bookmarkStart w:id="80" w:name="dev.vars-本地环境变量"/>
+    <w:p>
+      <w:pPr>
+        <w:pStyle w:val="Heading3"/>
+      </w:pPr>
+      <w:r>
+        <w:t xml:space="preserve">.dev.vars 本地环境变量</w:t>
+      </w:r>
+    </w:p>
+    <w:p>
+      <w:pPr>
+        <w:pStyle w:val="SourceCode"/>
+      </w:pPr>
+      <w:r>
+        <w:rPr>
+          <w:rStyle w:val="VerbatimChar"/>
+        </w:rPr>
+        <w:t xml:space="preserve">OPENAI_API_KEY=sk-xxx</w:t>
+      </w:r>
+    </w:p>
+    <w:bookmarkEnd w:id="80"/>
+    <w:bookmarkStart w:id="81" w:name="vite.config.ts"/>
+    <w:p>
+      <w:pPr>
+        <w:pStyle w:val="Heading3"/>
+      </w:pPr>
+      <w:r>
+        <w:t xml:space="preserve">vite.config.ts</w:t>
+      </w:r>
+    </w:p>
+    <w:p>
+      <w:pPr>
+        <w:pStyle w:val="SourceCode"/>
+      </w:pPr>
+      <w:r>
+        <w:rPr>
+          <w:rStyle w:val="ImportTok"/>
+        </w:rPr>
+        <w:t xml:space="preserve">import</w:t>
+      </w:r>
+      <w:r>
+        <w:rPr>
+          <w:rStyle w:val="NormalTok"/>
+        </w:rPr>
+        <w:t xml:space="preserve"> { defineConfig } </w:t>
+      </w:r>
+      <w:r>
+        <w:rPr>
+          <w:rStyle w:val="ImportTok"/>
+        </w:rPr>
+        <w:t xml:space="preserve">from</w:t>
+      </w:r>
+      <w:r>
+        <w:rPr>
+          <w:rStyle w:val="NormalTok"/>
+        </w:rPr>
+        <w:t xml:space="preserve"> </w:t>
+      </w:r>
+      <w:r>
+        <w:rPr>
+          <w:rStyle w:val="StringTok"/>
+        </w:rPr>
+        <w:t xml:space="preserve">'vite'</w:t>
+      </w:r>
+      <w:r>
+        <w:br/>
+      </w:r>
+      <w:r>
+        <w:rPr>
+          <w:rStyle w:val="ImportTok"/>
+        </w:rPr>
+        <w:t xml:space="preserve">import</w:t>
+      </w:r>
+      <w:r>
+        <w:rPr>
+          <w:rStyle w:val="NormalTok"/>
+        </w:rPr>
+        <w:t xml:space="preserve"> pages </w:t>
+      </w:r>
+      <w:r>
+        <w:rPr>
+          <w:rStyle w:val="ImportTok"/>
+        </w:rPr>
+        <w:t xml:space="preserve">from</w:t>
+      </w:r>
+      <w:r>
+        <w:rPr>
+          <w:rStyle w:val="NormalTok"/>
+        </w:rPr>
+        <w:t xml:space="preserve"> </w:t>
+      </w:r>
+      <w:r>
+        <w:rPr>
+          <w:rStyle w:val="StringTok"/>
+        </w:rPr>
+        <w:t xml:space="preserve">'@hono/vite-cloudflare-pages'</w:t>
+      </w:r>
+      <w:r>
+        <w:br/>
+      </w:r>
+      <w:r>
+        <w:br/>
+      </w:r>
+      <w:r>
+        <w:rPr>
+          <w:rStyle w:val="ImportTok"/>
+        </w:rPr>
+        <w:t xml:space="preserve">export</w:t>
+      </w:r>
+      <w:r>
+        <w:rPr>
+          <w:rStyle w:val="NormalTok"/>
+        </w:rPr>
+        <w:t xml:space="preserve"> </w:t>
+      </w:r>
+      <w:r>
+        <w:rPr>
+          <w:rStyle w:val="ImportTok"/>
+        </w:rPr>
+        <w:t xml:space="preserve">default</w:t>
+      </w:r>
+      <w:r>
+        <w:rPr>
+          <w:rStyle w:val="NormalTok"/>
+        </w:rPr>
+        <w:t xml:space="preserve"> </w:t>
+      </w:r>
+      <w:r>
+        <w:rPr>
+          <w:rStyle w:val="FunctionTok"/>
+        </w:rPr>
+        <w:t xml:space="preserve">defineConfig</w:t>
+      </w:r>
+      <w:r>
+        <w:rPr>
+          <w:rStyle w:val="NormalTok"/>
+        </w:rPr>
+        <w:t xml:space="preserve">({</w:t>
+      </w:r>
+      <w:r>
+        <w:br/>
+      </w:r>
+      <w:r>
+        <w:rPr>
+          <w:rStyle w:val="NormalTok"/>
+        </w:rPr>
+        <w:t xml:space="preserve">  plugins</w:t>
+      </w:r>
+      <w:r>
+        <w:rPr>
+          <w:rStyle w:val="OperatorTok"/>
+        </w:rPr>
+        <w:t xml:space="preserve">:</w:t>
+      </w:r>
+      <w:r>
+        <w:rPr>
+          <w:rStyle w:val="NormalTok"/>
+        </w:rPr>
+        <w:t xml:space="preserve"> [</w:t>
+      </w:r>
+      <w:r>
+        <w:rPr>
+          <w:rStyle w:val="FunctionTok"/>
+        </w:rPr>
+        <w:t xml:space="preserve">pages</w:t>
+      </w:r>
+      <w:r>
+        <w:rPr>
+          <w:rStyle w:val="NormalTok"/>
+        </w:rPr>
+        <w:t xml:space="preserve">()]</w:t>
+      </w:r>
+      <w:r>
+        <w:rPr>
+          <w:rStyle w:val="OperatorTok"/>
+        </w:rPr>
+        <w:t xml:space="preserve">,</w:t>
+      </w:r>
+      <w:r>
+        <w:br/>
+      </w:r>
+      <w:r>
+        <w:rPr>
+          <w:rStyle w:val="NormalTok"/>
+        </w:rPr>
+        <w:t xml:space="preserve">  build</w:t>
+      </w:r>
+      <w:r>
+        <w:rPr>
+          <w:rStyle w:val="OperatorTok"/>
+        </w:rPr>
+        <w:t xml:space="preserve">:</w:t>
+      </w:r>
+      <w:r>
+        <w:rPr>
+          <w:rStyle w:val="NormalTok"/>
+        </w:rPr>
+        <w:t xml:space="preserve"> {</w:t>
+      </w:r>
+      <w:r>
+        <w:br/>
+      </w:r>
+      <w:r>
+        <w:rPr>
+          <w:rStyle w:val="NormalTok"/>
+        </w:rPr>
+        <w:t xml:space="preserve">    outDir</w:t>
+      </w:r>
+      <w:r>
+        <w:rPr>
+          <w:rStyle w:val="OperatorTok"/>
+        </w:rPr>
+        <w:t xml:space="preserve">:</w:t>
+      </w:r>
+      <w:r>
+        <w:rPr>
+          <w:rStyle w:val="NormalTok"/>
+        </w:rPr>
+        <w:t xml:space="preserve"> </w:t>
+      </w:r>
+      <w:r>
+        <w:rPr>
+          <w:rStyle w:val="StringTok"/>
+        </w:rPr>
+        <w:t xml:space="preserve">'dist'</w:t>
+      </w:r>
+      <w:r>
+        <w:br/>
+      </w:r>
+      <w:r>
+        <w:rPr>
+          <w:rStyle w:val="NormalTok"/>
+        </w:rPr>
+        <w:t xml:space="preserve">  }</w:t>
+      </w:r>
+      <w:r>
+        <w:br/>
+      </w:r>
+      <w:r>
+        <w:rPr>
+          <w:rStyle w:val="NormalTok"/>
+        </w:rPr>
+        <w:t xml:space="preserve">})</w:t>
+      </w:r>
+    </w:p>
+    <w:bookmarkEnd w:id="81"/>
+    <w:bookmarkStart w:id="82" w:name="ecosystem.config.cjs-pm2-配置"/>
+    <w:p>
+      <w:pPr>
+        <w:pStyle w:val="Heading3"/>
+      </w:pPr>
+      <w:r>
+        <w:t xml:space="preserve">ecosystem.config.cjs (PM2 配置)</w:t>
+      </w:r>
+    </w:p>
+    <w:p>
+      <w:pPr>
+        <w:pStyle w:val="SourceCode"/>
+      </w:pPr>
+      <w:r>
+        <w:rPr>
+          <w:rStyle w:val="NormalTok"/>
+        </w:rPr>
+        <w:t xml:space="preserve">module</w:t>
+      </w:r>
+      <w:r>
+        <w:rPr>
+          <w:rStyle w:val="OperatorTok"/>
+        </w:rPr>
+        <w:t xml:space="preserve">.</w:t>
+      </w:r>
+      <w:r>
+        <w:rPr>
+          <w:rStyle w:val="AttributeTok"/>
+        </w:rPr>
+        <w:t xml:space="preserve">exports</w:t>
+      </w:r>
+      <w:r>
+        <w:rPr>
+          <w:rStyle w:val="NormalTok"/>
+        </w:rPr>
+        <w:t xml:space="preserve"> </w:t>
+      </w:r>
+      <w:r>
+        <w:rPr>
+          <w:rStyle w:val="OperatorTok"/>
+        </w:rPr>
+        <w:t xml:space="preserve">=</w:t>
+      </w:r>
+      <w:r>
+        <w:rPr>
+          <w:rStyle w:val="NormalTok"/>
+        </w:rPr>
+        <w:t xml:space="preserve"> {</w:t>
+      </w:r>
+      <w:r>
+        <w:br/>
+      </w:r>
+      <w:r>
+        <w:rPr>
+          <w:rStyle w:val="NormalTok"/>
+        </w:rPr>
+        <w:t xml:space="preserve">  </w:t>
+      </w:r>
+      <w:r>
+        <w:rPr>
+          <w:rStyle w:val="DataTypeTok"/>
+        </w:rPr>
+        <w:t xml:space="preserve">apps</w:t>
+      </w:r>
+      <w:r>
+        <w:rPr>
+          <w:rStyle w:val="OperatorTok"/>
+        </w:rPr>
+        <w:t xml:space="preserve">:</w:t>
+      </w:r>
+      <w:r>
+        <w:rPr>
+          <w:rStyle w:val="NormalTok"/>
+        </w:rPr>
+        <w:t xml:space="preserve"> [</w:t>
+      </w:r>
+      <w:r>
+        <w:br/>
+      </w:r>
+      <w:r>
+        <w:rPr>
+          <w:rStyle w:val="NormalTok"/>
+        </w:rPr>
+        <w:t xml:space="preserve">    {</w:t>
+      </w:r>
+      <w:r>
+        <w:br/>
+      </w:r>
+      <w:r>
+        <w:rPr>
+          <w:rStyle w:val="NormalTok"/>
+        </w:rPr>
+        <w:t xml:space="preserve">      </w:t>
+      </w:r>
+      <w:r>
+        <w:rPr>
+          <w:rStyle w:val="DataTypeTok"/>
+        </w:rPr>
+        <w:t xml:space="preserve">name</w:t>
+      </w:r>
+      <w:r>
+        <w:rPr>
+          <w:rStyle w:val="OperatorTok"/>
+        </w:rPr>
+        <w:t xml:space="preserve">:</w:t>
+      </w:r>
+      <w:r>
+        <w:rPr>
+          <w:rStyle w:val="NormalTok"/>
+        </w:rPr>
+        <w:t xml:space="preserve"> </w:t>
+      </w:r>
+      <w:r>
+        <w:rPr>
+          <w:rStyle w:val="StringTok"/>
+        </w:rPr>
+        <w:t xml:space="preserve">'originate-connect'</w:t>
+      </w:r>
+      <w:r>
+        <w:rPr>
+          <w:rStyle w:val="OperatorTok"/>
+        </w:rPr>
+        <w:t xml:space="preserve">,</w:t>
+      </w:r>
+      <w:r>
+        <w:br/>
+      </w:r>
+      <w:r>
+        <w:rPr>
+          <w:rStyle w:val="NormalTok"/>
+        </w:rPr>
+        <w:t xml:space="preserve">      </w:t>
+      </w:r>
+      <w:r>
+        <w:rPr>
+          <w:rStyle w:val="DataTypeTok"/>
+        </w:rPr>
+        <w:t xml:space="preserve">script</w:t>
+      </w:r>
+      <w:r>
+        <w:rPr>
+          <w:rStyle w:val="OperatorTok"/>
+        </w:rPr>
+        <w:t xml:space="preserve">:</w:t>
+      </w:r>
+      <w:r>
+        <w:rPr>
+          <w:rStyle w:val="NormalTok"/>
+        </w:rPr>
+        <w:t xml:space="preserve"> </w:t>
+      </w:r>
+      <w:r>
+        <w:rPr>
+          <w:rStyle w:val="StringTok"/>
+        </w:rPr>
+        <w:t xml:space="preserve">'npx'</w:t>
+      </w:r>
+      <w:r>
+        <w:rPr>
+          <w:rStyle w:val="OperatorTok"/>
+        </w:rPr>
+        <w:t xml:space="preserve">,</w:t>
+      </w:r>
+      <w:r>
+        <w:br/>
+      </w:r>
+      <w:r>
+        <w:rPr>
+          <w:rStyle w:val="NormalTok"/>
+        </w:rPr>
+        <w:t xml:space="preserve">      </w:t>
+      </w:r>
+      <w:r>
+        <w:rPr>
+          <w:rStyle w:val="DataTypeTok"/>
+        </w:rPr>
+        <w:t xml:space="preserve">args</w:t>
+      </w:r>
+      <w:r>
+        <w:rPr>
+          <w:rStyle w:val="OperatorTok"/>
+        </w:rPr>
+        <w:t xml:space="preserve">:</w:t>
+      </w:r>
+      <w:r>
+        <w:rPr>
+          <w:rStyle w:val="NormalTok"/>
+        </w:rPr>
+        <w:t xml:space="preserve"> </w:t>
+      </w:r>
+      <w:r>
+        <w:rPr>
+          <w:rStyle w:val="StringTok"/>
+        </w:rPr>
+        <w:t xml:space="preserve">'wrangler pages dev dist --ip 0.0.0.0 --port 3000'</w:t>
+      </w:r>
+      <w:r>
+        <w:rPr>
+          <w:rStyle w:val="OperatorTok"/>
+        </w:rPr>
+        <w:t xml:space="preserve">,</w:t>
+      </w:r>
+      <w:r>
+        <w:br/>
+      </w:r>
+      <w:r>
+        <w:rPr>
+          <w:rStyle w:val="NormalTok"/>
+        </w:rPr>
+        <w:t xml:space="preserve">      </w:t>
+      </w:r>
+      <w:r>
+        <w:rPr>
+          <w:rStyle w:val="DataTypeTok"/>
+        </w:rPr>
+        <w:t xml:space="preserve">env</w:t>
+      </w:r>
+      <w:r>
+        <w:rPr>
+          <w:rStyle w:val="OperatorTok"/>
+        </w:rPr>
+        <w:t xml:space="preserve">:</w:t>
+      </w:r>
+      <w:r>
+        <w:rPr>
+          <w:rStyle w:val="NormalTok"/>
+        </w:rPr>
+        <w:t xml:space="preserve"> {</w:t>
+      </w:r>
+      <w:r>
+        <w:br/>
+      </w:r>
+      <w:r>
+        <w:rPr>
+          <w:rStyle w:val="NormalTok"/>
+        </w:rPr>
+        <w:t xml:space="preserve">        </w:t>
+      </w:r>
+      <w:r>
+        <w:rPr>
+          <w:rStyle w:val="DataTypeTok"/>
+        </w:rPr>
+        <w:t xml:space="preserve">NODE_ENV</w:t>
+      </w:r>
+      <w:r>
+        <w:rPr>
+          <w:rStyle w:val="OperatorTok"/>
+        </w:rPr>
+        <w:t xml:space="preserve">:</w:t>
+      </w:r>
+      <w:r>
+        <w:rPr>
+          <w:rStyle w:val="NormalTok"/>
+        </w:rPr>
+        <w:t xml:space="preserve"> </w:t>
+      </w:r>
+      <w:r>
+        <w:rPr>
+          <w:rStyle w:val="StringTok"/>
+        </w:rPr>
+        <w:t xml:space="preserve">'development'</w:t>
+      </w:r>
+      <w:r>
+        <w:rPr>
+          <w:rStyle w:val="OperatorTok"/>
+        </w:rPr>
+        <w:t xml:space="preserve">,</w:t>
+      </w:r>
+      <w:r>
+        <w:br/>
+      </w:r>
+      <w:r>
+        <w:rPr>
+          <w:rStyle w:val="NormalTok"/>
+        </w:rPr>
+        <w:t xml:space="preserve">        </w:t>
+      </w:r>
+      <w:r>
+        <w:rPr>
+          <w:rStyle w:val="DataTypeTok"/>
+        </w:rPr>
+        <w:t xml:space="preserve">PORT</w:t>
+      </w:r>
+      <w:r>
+        <w:rPr>
+          <w:rStyle w:val="OperatorTok"/>
+        </w:rPr>
+        <w:t xml:space="preserve">:</w:t>
+      </w:r>
+      <w:r>
+        <w:rPr>
+          <w:rStyle w:val="NormalTok"/>
+        </w:rPr>
+        <w:t xml:space="preserve"> </w:t>
+      </w:r>
+      <w:r>
+        <w:rPr>
+          <w:rStyle w:val="DecValTok"/>
+        </w:rPr>
+        <w:t xml:space="preserve">3000</w:t>
+      </w:r>
+      <w:r>
+        <w:br/>
+      </w:r>
+      <w:r>
+        <w:rPr>
+          <w:rStyle w:val="NormalTok"/>
+        </w:rPr>
+        <w:t xml:space="preserve">      }</w:t>
+      </w:r>
+      <w:r>
+        <w:rPr>
+          <w:rStyle w:val="OperatorTok"/>
+        </w:rPr>
+        <w:t xml:space="preserve">,</w:t>
+      </w:r>
+      <w:r>
+        <w:br/>
+      </w:r>
+      <w:r>
+        <w:rPr>
+          <w:rStyle w:val="NormalTok"/>
+        </w:rPr>
+        <w:t xml:space="preserve">      </w:t>
+      </w:r>
+      <w:r>
+        <w:rPr>
+          <w:rStyle w:val="DataTypeTok"/>
+        </w:rPr>
+        <w:t xml:space="preserve">watch</w:t>
+      </w:r>
+      <w:r>
+        <w:rPr>
+          <w:rStyle w:val="OperatorTok"/>
+        </w:rPr>
+        <w:t xml:space="preserve">:</w:t>
+      </w:r>
+      <w:r>
+        <w:rPr>
+          <w:rStyle w:val="NormalTok"/>
+        </w:rPr>
+        <w:t xml:space="preserve"> </w:t>
+      </w:r>
+      <w:r>
+        <w:rPr>
+          <w:rStyle w:val="KeywordTok"/>
+        </w:rPr>
+        <w:t xml:space="preserve">false</w:t>
+      </w:r>
+      <w:r>
+        <w:rPr>
+          <w:rStyle w:val="OperatorTok"/>
+        </w:rPr>
+        <w:t xml:space="preserve">,</w:t>
+      </w:r>
+      <w:r>
+        <w:br/>
+      </w:r>
+      <w:r>
+        <w:rPr>
+          <w:rStyle w:val="NormalTok"/>
+        </w:rPr>
+        <w:t xml:space="preserve">      </w:t>
+      </w:r>
+      <w:r>
+        <w:rPr>
+          <w:rStyle w:val="DataTypeTok"/>
+        </w:rPr>
+        <w:t xml:space="preserve">instances</w:t>
+      </w:r>
+      <w:r>
+        <w:rPr>
+          <w:rStyle w:val="OperatorTok"/>
+        </w:rPr>
+        <w:t xml:space="preserve">:</w:t>
+      </w:r>
+      <w:r>
+        <w:rPr>
+          <w:rStyle w:val="NormalTok"/>
+        </w:rPr>
+        <w:t xml:space="preserve"> </w:t>
+      </w:r>
+      <w:r>
+        <w:rPr>
+          <w:rStyle w:val="DecValTok"/>
+        </w:rPr>
+        <w:t xml:space="preserve">1</w:t>
+      </w:r>
+      <w:r>
+        <w:rPr>
+          <w:rStyle w:val="OperatorTok"/>
+        </w:rPr>
+        <w:t xml:space="preserve">,</w:t>
+      </w:r>
+      <w:r>
+        <w:br/>
+      </w:r>
+      <w:r>
+        <w:rPr>
+          <w:rStyle w:val="NormalTok"/>
+        </w:rPr>
+        <w:t xml:space="preserve">      </w:t>
+      </w:r>
+      <w:r>
+        <w:rPr>
+          <w:rStyle w:val="DataTypeTok"/>
+        </w:rPr>
+        <w:t xml:space="preserve">exec_mode</w:t>
+      </w:r>
+      <w:r>
+        <w:rPr>
+          <w:rStyle w:val="OperatorTok"/>
+        </w:rPr>
+        <w:t xml:space="preserve">:</w:t>
+      </w:r>
+      <w:r>
+        <w:rPr>
+          <w:rStyle w:val="NormalTok"/>
+        </w:rPr>
+        <w:t xml:space="preserve"> </w:t>
+      </w:r>
+      <w:r>
+        <w:rPr>
+          <w:rStyle w:val="StringTok"/>
+        </w:rPr>
+        <w:t xml:space="preserve">'fork'</w:t>
+      </w:r>
+      <w:r>
+        <w:br/>
+      </w:r>
+      <w:r>
+        <w:rPr>
+          <w:rStyle w:val="NormalTok"/>
+        </w:rPr>
+        <w:t xml:space="preserve">    }</w:t>
+      </w:r>
+      <w:r>
+        <w:br/>
+      </w:r>
+      <w:r>
+        <w:rPr>
+          <w:rStyle w:val="NormalTok"/>
+        </w:rPr>
+        <w:t xml:space="preserve">  ]</w:t>
+      </w:r>
+      <w:r>
+        <w:br/>
+      </w:r>
+      <w:r>
+        <w:rPr>
+          <w:rStyle w:val="NormalTok"/>
+        </w:rPr>
+        <w:t xml:space="preserve">}</w:t>
+      </w:r>
+    </w:p>
+    <w:bookmarkEnd w:id="82"/>
+    <w:bookmarkStart w:id="83" w:name="package.json-scripts"/>
+    <w:p>
+      <w:pPr>
+        <w:pStyle w:val="Heading3"/>
+      </w:pPr>
+      <w:r>
+        <w:t xml:space="preserve">package.json scripts</w:t>
+      </w:r>
+    </w:p>
+    <w:p>
+      <w:pPr>
+        <w:pStyle w:val="SourceCode"/>
+      </w:pPr>
+      <w:r>
+        <w:rPr>
+          <w:rStyle w:val="FunctionTok"/>
+        </w:rPr>
+        <w:t xml:space="preserve">{</w:t>
+      </w:r>
+      <w:r>
+        <w:br/>
+      </w:r>
+      <w:r>
+        <w:rPr>
+          <w:rStyle w:val="NormalTok"/>
+        </w:rPr>
+        <w:t xml:space="preserve">  </w:t>
+      </w:r>
+      <w:r>
+        <w:rPr>
+          <w:rStyle w:val="DataTypeTok"/>
+        </w:rPr>
+        <w:t xml:space="preserve">"scripts"</w:t>
+      </w:r>
+      <w:r>
+        <w:rPr>
+          <w:rStyle w:val="FunctionTok"/>
+        </w:rPr>
+        <w:t xml:space="preserve">:</w:t>
+      </w:r>
+      <w:r>
+        <w:rPr>
+          <w:rStyle w:val="NormalTok"/>
+        </w:rPr>
+        <w:t xml:space="preserve"> </w:t>
+      </w:r>
+      <w:r>
+        <w:rPr>
+          <w:rStyle w:val="FunctionTok"/>
+        </w:rPr>
+        <w:t xml:space="preserve">{</w:t>
+      </w:r>
+      <w:r>
+        <w:br/>
+      </w:r>
+      <w:r>
+        <w:rPr>
+          <w:rStyle w:val="NormalTok"/>
+        </w:rPr>
+        <w:t xml:space="preserve">    </w:t>
+      </w:r>
+      <w:r>
+        <w:rPr>
+          <w:rStyle w:val="DataTypeTok"/>
+        </w:rPr>
+        <w:t xml:space="preserve">"dev"</w:t>
+      </w:r>
+      <w:r>
+        <w:rPr>
+          <w:rStyle w:val="FunctionTok"/>
+        </w:rPr>
+        <w:t xml:space="preserve">:</w:t>
+      </w:r>
+      <w:r>
+        <w:rPr>
+          <w:rStyle w:val="NormalTok"/>
+        </w:rPr>
+        <w:t xml:space="preserve"> </w:t>
+      </w:r>
+      <w:r>
+        <w:rPr>
+          <w:rStyle w:val="StringTok"/>
+        </w:rPr>
+        <w:t xml:space="preserve">"vite"</w:t>
+      </w:r>
+      <w:r>
+        <w:rPr>
+          <w:rStyle w:val="FunctionTok"/>
+        </w:rPr>
+        <w:t xml:space="preserve">,</w:t>
+      </w:r>
+      <w:r>
+        <w:br/>
+      </w:r>
+      <w:r>
+        <w:rPr>
+          <w:rStyle w:val="NormalTok"/>
+        </w:rPr>
+        <w:t xml:space="preserve">    </w:t>
+      </w:r>
+      <w:r>
+        <w:rPr>
+          <w:rStyle w:val="DataTypeTok"/>
+        </w:rPr>
+        <w:t xml:space="preserve">"build"</w:t>
+      </w:r>
+      <w:r>
+        <w:rPr>
+          <w:rStyle w:val="FunctionTok"/>
+        </w:rPr>
+        <w:t xml:space="preserve">:</w:t>
+      </w:r>
+      <w:r>
+        <w:rPr>
+          <w:rStyle w:val="NormalTok"/>
+        </w:rPr>
+        <w:t xml:space="preserve"> </w:t>
+      </w:r>
+      <w:r>
+        <w:rPr>
+          <w:rStyle w:val="StringTok"/>
+        </w:rPr>
+        <w:t xml:space="preserve">"vite build"</w:t>
+      </w:r>
+      <w:r>
+        <w:rPr>
+          <w:rStyle w:val="FunctionTok"/>
+        </w:rPr>
+        <w:t xml:space="preserve">,</w:t>
+      </w:r>
+      <w:r>
+        <w:br/>
+      </w:r>
+      <w:r>
+        <w:rPr>
+          <w:rStyle w:val="NormalTok"/>
+        </w:rPr>
+        <w:t xml:space="preserve">    </w:t>
+      </w:r>
+      <w:r>
+        <w:rPr>
+          <w:rStyle w:val="DataTypeTok"/>
+        </w:rPr>
+        <w:t xml:space="preserve">"preview"</w:t>
+      </w:r>
+      <w:r>
+        <w:rPr>
+          <w:rStyle w:val="FunctionTok"/>
+        </w:rPr>
+        <w:t xml:space="preserve">:</w:t>
+      </w:r>
+      <w:r>
+        <w:rPr>
+          <w:rStyle w:val="NormalTok"/>
+        </w:rPr>
+        <w:t xml:space="preserve"> </w:t>
+      </w:r>
+      <w:r>
+        <w:rPr>
+          <w:rStyle w:val="StringTok"/>
+        </w:rPr>
+        <w:t xml:space="preserve">"wrangler pages dev dist"</w:t>
+      </w:r>
+      <w:r>
+        <w:rPr>
+          <w:rStyle w:val="FunctionTok"/>
+        </w:rPr>
+        <w:t xml:space="preserve">,</w:t>
+      </w:r>
+      <w:r>
+        <w:br/>
+      </w:r>
+      <w:r>
+        <w:rPr>
+          <w:rStyle w:val="NormalTok"/>
+        </w:rPr>
+        <w:t xml:space="preserve">    </w:t>
+      </w:r>
+      <w:r>
+        <w:rPr>
+          <w:rStyle w:val="DataTypeTok"/>
+        </w:rPr>
+        <w:t xml:space="preserve">"deploy"</w:t>
+      </w:r>
+      <w:r>
+        <w:rPr>
+          <w:rStyle w:val="FunctionTok"/>
+        </w:rPr>
+        <w:t xml:space="preserve">:</w:t>
+      </w:r>
+      <w:r>
+        <w:rPr>
+          <w:rStyle w:val="NormalTok"/>
+        </w:rPr>
+        <w:t xml:space="preserve"> </w:t>
+      </w:r>
+      <w:r>
+        <w:rPr>
+          <w:rStyle w:val="StringTok"/>
+        </w:rPr>
+        <w:t xml:space="preserve">"npm run build &amp;&amp; wrangler pages deploy dist"</w:t>
+      </w:r>
+      <w:r>
+        <w:br/>
+      </w:r>
+      <w:r>
+        <w:rPr>
+          <w:rStyle w:val="NormalTok"/>
+        </w:rPr>
+        <w:t xml:space="preserve">  </w:t>
+      </w:r>
+      <w:r>
+        <w:rPr>
+          <w:rStyle w:val="FunctionTok"/>
+        </w:rPr>
+        <w:t xml:space="preserve">}</w:t>
+      </w:r>
+      <w:r>
+        <w:br/>
+      </w:r>
+      <w:r>
+        <w:rPr>
+          <w:rStyle w:val="FunctionTok"/>
+        </w:rPr>
+        <w:t xml:space="preserve">}</w:t>
+      </w:r>
+    </w:p>
+    <w:bookmarkEnd w:id="83"/>
+    <w:bookmarkStart w:id="84" w:name="步骤-3-实现顺序"/>
     <w:p>
       <w:pPr>
         <w:pStyle w:val="Heading3"/>
@@ -30122,8 +31805,8 @@
         <w:t xml:space="preserve">— IntersectionObserver + reveal 类</w:t>
       </w:r>
     </w:p>
-    <w:bookmarkEnd w:id="78"/>
-    <w:bookmarkStart w:id="79" w:name="步骤-4-路由结构"/>
+    <w:bookmarkEnd w:id="84"/>
+    <w:bookmarkStart w:id="85" w:name="步骤-4-路由结构"/>
     <w:p>
       <w:pPr>
         <w:pStyle w:val="Heading3"/>
@@ -31238,8 +32921,8 @@
         <w:t xml:space="preserve"> })</w:t>
       </w:r>
     </w:p>
-    <w:bookmarkEnd w:id="79"/>
-    <w:bookmarkStart w:id="80" w:name="步骤-5-ai-集成"/>
+    <w:bookmarkEnd w:id="85"/>
+    <w:bookmarkStart w:id="86" w:name="步骤-5-ai-集成"/>
     <w:p>
       <w:pPr>
         <w:pStyle w:val="Heading3"/>
@@ -32246,8 +33929,8 @@
         <w:t xml:space="preserve">})</w:t>
       </w:r>
     </w:p>
-    <w:bookmarkEnd w:id="80"/>
-    <w:bookmarkStart w:id="81" w:name="步骤-6-构建和部署"/>
+    <w:bookmarkEnd w:id="86"/>
+    <w:bookmarkStart w:id="87" w:name="步骤-6-构建和部署"/>
     <w:p>
       <w:pPr>
         <w:pStyle w:val="Heading3"/>
@@ -32312,8 +33995,8 @@
         <w:t xml:space="preserve"> 3000</w:t>
       </w:r>
     </w:p>
-    <w:bookmarkEnd w:id="81"/>
-    <w:bookmarkStart w:id="82" w:name="步骤-7-回主站配置跳转"/>
+    <w:bookmarkEnd w:id="87"/>
+    <w:bookmarkStart w:id="88" w:name="步骤-7-回主站配置跳转"/>
     <w:p>
       <w:pPr>
         <w:pStyle w:val="Heading3"/>
@@ -32367,9 +34050,9 @@
         </w:pict>
       </w:r>
     </w:p>
-    <w:bookmarkEnd w:id="82"/>
-    <w:bookmarkEnd w:id="83"/>
-    <w:bookmarkStart w:id="84" w:name="设计原则必须遵守"/>
+    <w:bookmarkEnd w:id="88"/>
+    <w:bookmarkEnd w:id="89"/>
+    <w:bookmarkStart w:id="90" w:name="设计原则必须遵守"/>
     <w:p>
       <w:pPr>
         <w:pStyle w:val="Heading2"/>
@@ -32590,8 +34273,8 @@
         </w:pict>
       </w:r>
     </w:p>
-    <w:bookmarkEnd w:id="84"/>
-    <w:bookmarkStart w:id="85" w:name="注意事项"/>
+    <w:bookmarkEnd w:id="90"/>
+    <w:bookmarkStart w:id="91" w:name="注意事项"/>
     <w:p>
       <w:pPr>
         <w:pStyle w:val="Heading2"/>
@@ -32826,8 +34509,8 @@
         </w:pict>
       </w:r>
     </w:p>
-    <w:bookmarkEnd w:id="85"/>
-    <w:bookmarkStart w:id="86" w:name="与其他通的关系未来规划"/>
+    <w:bookmarkEnd w:id="91"/>
+    <w:bookmarkStart w:id="92" w:name="与其他通的关系未来规划"/>
     <w:p>
       <w:pPr>
         <w:pStyle w:val="Heading2"/>
@@ -33076,8 +34759,8 @@
         <w:t xml:space="preserve">此 Prompt 可直接交给 Genspark 全栈模式生成代码，无需额外补充信息。</w:t>
       </w:r>
     </w:p>
-    <w:bookmarkEnd w:id="86"/>
-    <w:bookmarkEnd w:id="87"/>
+    <w:bookmarkEnd w:id="92"/>
+    <w:bookmarkEnd w:id="93"/>
     <w:sectPr/>
   </w:body>
 </w:document>

</xml_diff>